<commit_message>
datapreprocess.py function initially done modified MS
</commit_message>
<xml_diff>
--- a/MS/coverletter science-ME.docx
+++ b/MS/coverletter science-ME.docx
@@ -321,16 +321,14 @@
         </w:rPr>
         <w:t xml:space="preserve"> both the traditional hypotheses that </w:t>
       </w:r>
-      <w:ins w:id="0" w:author="RuiLiu" w:date="2019-03-25T15:47:00Z">
-        <w:r>
-          <w:rPr>
-            <w:rFonts w:ascii="Times New Roman" w:hAnsi="Times New Roman" w:cs="Times New Roman"/>
-            <w:sz w:val="24"/>
-            <w:szCs w:val="24"/>
-          </w:rPr>
-          <w:t xml:space="preserve">either </w:t>
-        </w:r>
-      </w:ins>
+      <w:r>
+        <w:rPr>
+          <w:rFonts w:ascii="Times New Roman" w:hAnsi="Times New Roman" w:cs="Times New Roman"/>
+          <w:sz w:val="24"/>
+          <w:szCs w:val="24"/>
+        </w:rPr>
+        <w:t xml:space="preserve">either </w:t>
+      </w:r>
       <w:r>
         <w:rPr>
           <w:rFonts w:ascii="Times New Roman" w:hAnsi="Times New Roman" w:cs="Times New Roman"/>
@@ -411,24 +409,8 @@
         </w:rPr>
         <w:t xml:space="preserve">long divergence time </w:t>
       </w:r>
-      <w:del w:id="1" w:author="RuiLiu" w:date="2019-03-25T12:13:00Z">
-        <w:r>
-          <w:rPr>
-            <w:rFonts w:ascii="Times New Roman" w:hAnsi="Times New Roman" w:cs="Times New Roman"/>
-            <w:sz w:val="24"/>
-            <w:szCs w:val="24"/>
-          </w:rPr>
-          <w:delText>occurred</w:delText>
-        </w:r>
-        <w:r>
-          <w:rPr>
-            <w:rFonts w:ascii="Times New Roman" w:hAnsi="Times New Roman" w:cs="Times New Roman"/>
-            <w:sz w:val="24"/>
-            <w:szCs w:val="24"/>
-          </w:rPr>
-          <w:delText xml:space="preserve"> </w:delText>
-        </w:r>
-      </w:del>
+      <w:bookmarkStart w:id="0" w:name="_GoBack"/>
+      <w:bookmarkEnd w:id="0"/>
       <w:r>
         <w:rPr>
           <w:rFonts w:ascii="Times New Roman" w:hAnsi="Times New Roman" w:cs="Times New Roman"/>
@@ -1240,25 +1222,7 @@
           <w:sz w:val="24"/>
           <w:szCs w:val="24"/>
         </w:rPr>
-        <w:t xml:space="preserve"> </w:t>
-      </w:r>
-      <w:bookmarkStart w:id="2" w:name="_GoBack"/>
-      <w:r>
-        <w:rPr>
-          <w:rFonts w:ascii="Times New Roman" w:hAnsi="Times New Roman" w:cs="Times New Roman"/>
-          <w:sz w:val="24"/>
-          <w:szCs w:val="24"/>
-        </w:rPr>
-        <w:t xml:space="preserve">may </w:t>
-      </w:r>
-      <w:bookmarkEnd w:id="2"/>
-      <w:r>
-        <w:rPr>
-          <w:rFonts w:ascii="Times New Roman" w:hAnsi="Times New Roman" w:cs="Times New Roman"/>
-          <w:sz w:val="24"/>
-          <w:szCs w:val="24"/>
-        </w:rPr>
-        <w:t xml:space="preserve">help </w:t>
+        <w:t xml:space="preserve"> may help </w:t>
       </w:r>
       <w:r>
         <w:rPr>
@@ -2512,14 +2476,6 @@
     </w:p>
   </w:footnote>
 </w:footnotes>
-</file>
-
-<file path=word/people.xml><?xml version="1.0" encoding="utf-8"?>
-<w15:people xmlns:wpc="http://schemas.microsoft.com/office/word/2010/wordprocessingCanvas" xmlns:cx="http://schemas.microsoft.com/office/drawing/2014/chartex" xmlns:cx1="http://schemas.microsoft.com/office/drawing/2015/9/8/chartex" xmlns:cx2="http://schemas.microsoft.com/office/drawing/2015/10/21/chartex" xmlns:cx3="http://schemas.microsoft.com/office/drawing/2016/5/9/chartex" xmlns:cx4="http://schemas.microsoft.com/office/drawing/2016/5/10/chartex" xmlns:cx5="http://schemas.microsoft.com/office/drawing/2016/5/11/chartex" xmlns:cx6="http://schemas.microsoft.com/office/drawing/2016/5/12/chartex" xmlns:cx7="http://schemas.microsoft.com/office/drawing/2016/5/13/chartex" xmlns:cx8="http://schemas.microsoft.com/office/drawing/2016/5/14/chartex" xmlns:mc="http://schemas.openxmlformats.org/markup-compatibility/2006" xmlns:aink="http://schemas.microsoft.com/office/drawing/2016/ink" xmlns:am3d="http://schemas.microsoft.com/office/drawing/2017/model3d" xmlns:o="urn:schemas-microsoft-com:office:office" xmlns:r="http://schemas.openxmlformats.org/officeDocument/2006/relationships" xmlns:m="http://schemas.openxmlformats.org/officeDocument/2006/math" xmlns:v="urn:schemas-microsoft-com:vml" xmlns:wp14="http://schemas.microsoft.com/office/word/2010/wordprocessingDrawing" xmlns:wp="http://schemas.openxmlformats.org/drawingml/2006/wordprocessingDrawing" xmlns:w10="urn:schemas-microsoft-com:office:word" xmlns:w="http://schemas.openxmlformats.org/wordprocessingml/2006/main" xmlns:w14="http://schemas.microsoft.com/office/word/2010/wordml" xmlns:w15="http://schemas.microsoft.com/office/word/2012/wordml" xmlns:w16cid="http://schemas.microsoft.com/office/word/2016/wordml/cid" xmlns:w16se="http://schemas.microsoft.com/office/word/2015/wordml/symex" xmlns:wpg="http://schemas.microsoft.com/office/word/2010/wordprocessingGroup" xmlns:wpi="http://schemas.microsoft.com/office/word/2010/wordprocessingInk" xmlns:wne="http://schemas.microsoft.com/office/word/2006/wordml" xmlns:wps="http://schemas.microsoft.com/office/word/2010/wordprocessingShape" mc:Ignorable="w14 w15 w16se w16cid wp14">
-  <w15:person w15:author="RuiLiu">
-    <w15:presenceInfo w15:providerId="None" w15:userId="RuiLiu"/>
-  </w15:person>
-</w15:people>
 </file>
 
 <file path=word/styles.xml><?xml version="1.0" encoding="utf-8"?>

</xml_diff>

<commit_message>
finish responsereviewer.py move to the next issue
</commit_message>
<xml_diff>
--- a/MS/coverletter science-ME.docx
+++ b/MS/coverletter science-ME.docx
@@ -1692,7 +1692,7 @@
     <w:p>
       <w:pPr>
         <w:spacing w:line="480" w:lineRule="auto"/>
-        <w:ind w:firstLineChars="200" w:firstLine="440"/>
+        <w:ind w:firstLineChars="200" w:firstLine="480"/>
         <w:rPr>
           <w:rFonts w:ascii="Times New Roman" w:eastAsia="等线" w:hAnsi="Times New Roman" w:cs="Times New Roman"/>
           <w:color w:val="000000"/>
@@ -1700,358 +1700,61 @@
           <w:szCs w:val="24"/>
         </w:rPr>
       </w:pPr>
-      <w:del w:id="0" w:author="RuiLiu" w:date="2019-05-21T11:26:00Z">
-        <w:r>
-          <w:rPr>
-            <w:rFonts w:ascii="Arial" w:eastAsia="等线" w:hAnsi="Arial" w:cs="Arial"/>
-            <w:noProof/>
-            <w:sz w:val="22"/>
-          </w:rPr>
-          <mc:AlternateContent>
-            <mc:Choice Requires="wps">
-              <w:drawing>
-                <wp:anchor distT="0" distB="0" distL="114300" distR="114300" simplePos="0" relativeHeight="251659264" behindDoc="0" locked="0" layoutInCell="1" allowOverlap="1" wp14:anchorId="45965670" wp14:editId="2BC5761A">
-                  <wp:simplePos x="0" y="0"/>
-                  <wp:positionH relativeFrom="margin">
-                    <wp:posOffset>0</wp:posOffset>
-                  </wp:positionH>
-                  <wp:positionV relativeFrom="paragraph">
-                    <wp:posOffset>727710</wp:posOffset>
-                  </wp:positionV>
-                  <wp:extent cx="2204720" cy="3331210"/>
-                  <wp:effectExtent l="0" t="0" r="0" b="2540"/>
-                  <wp:wrapNone/>
-                  <wp:docPr id="3" name="文本框 3"/>
-                  <wp:cNvGraphicFramePr>
-                    <a:graphicFrameLocks xmlns:a="http://schemas.openxmlformats.org/drawingml/2006/main"/>
-                  </wp:cNvGraphicFramePr>
-                  <a:graphic xmlns:a="http://schemas.openxmlformats.org/drawingml/2006/main">
-                    <a:graphicData uri="http://schemas.microsoft.com/office/word/2010/wordprocessingShape">
-                      <wps:wsp>
-                        <wps:cNvSpPr txBox="1">
-                          <a:spLocks noChangeArrowheads="1"/>
-                        </wps:cNvSpPr>
-                        <wps:spPr bwMode="auto">
-                          <a:xfrm>
-                            <a:off x="0" y="0"/>
-                            <a:ext cx="2204720" cy="3331210"/>
-                          </a:xfrm>
-                          <a:prstGeom prst="rect">
-                            <a:avLst/>
-                          </a:prstGeom>
-                          <a:noFill/>
-                          <a:ln w="9525">
-                            <a:noFill/>
-                            <a:miter lim="800000"/>
-                            <a:headEnd/>
-                            <a:tailEnd/>
-                          </a:ln>
-                        </wps:spPr>
-                        <wps:txbx>
-                          <w:txbxContent>
-                            <w:p>
-                              <w:pPr>
-                                <w:spacing w:line="480" w:lineRule="auto"/>
-                                <w:rPr>
-                                  <w:del w:id="1" w:author="RuiLiu" w:date="2019-05-21T11:26:00Z"/>
-                                  <w:rFonts w:ascii="Times New Roman" w:hAnsi="Times New Roman" w:cs="Times New Roman"/>
-                                  <w:sz w:val="24"/>
-                                  <w:szCs w:val="24"/>
-                                </w:rPr>
-                              </w:pPr>
-                              <w:bookmarkStart w:id="2" w:name="_GoBack"/>
-                              <w:bookmarkEnd w:id="2"/>
-                              <w:del w:id="3" w:author="RuiLiu" w:date="2019-05-21T11:26:00Z">
-                                <w:r>
-                                  <w:rPr>
-                                    <w:rFonts w:ascii="Times New Roman" w:hAnsi="Times New Roman" w:cs="Times New Roman"/>
-                                    <w:sz w:val="24"/>
-                                    <w:szCs w:val="24"/>
-                                  </w:rPr>
-                                  <w:delText>Yinhua Huang</w:delText>
-                                </w:r>
-                              </w:del>
-                            </w:p>
-                            <w:p>
-                              <w:pPr>
-                                <w:spacing w:line="480" w:lineRule="auto"/>
-                                <w:rPr>
-                                  <w:del w:id="4" w:author="RuiLiu" w:date="2019-05-21T11:26:00Z"/>
-                                  <w:rFonts w:ascii="Times New Roman" w:hAnsi="Times New Roman" w:cs="Times New Roman"/>
-                                  <w:sz w:val="24"/>
-                                  <w:szCs w:val="24"/>
-                                </w:rPr>
-                              </w:pPr>
-                              <w:del w:id="5" w:author="RuiLiu" w:date="2019-05-21T11:26:00Z">
-                                <w:r>
-                                  <w:rPr>
-                                    <w:rFonts w:ascii="Times New Roman" w:hAnsi="Times New Roman" w:cs="Times New Roman"/>
-                                    <w:sz w:val="24"/>
-                                    <w:szCs w:val="24"/>
-                                  </w:rPr>
-                                  <w:delText>Professor, Ph.D.</w:delText>
-                                </w:r>
-                              </w:del>
-                            </w:p>
-                            <w:p>
-                              <w:pPr>
-                                <w:spacing w:line="480" w:lineRule="auto"/>
-                                <w:rPr>
-                                  <w:del w:id="6" w:author="RuiLiu" w:date="2019-05-21T11:26:00Z"/>
-                                  <w:rFonts w:ascii="Times New Roman" w:hAnsi="Times New Roman" w:cs="Times New Roman"/>
-                                  <w:sz w:val="24"/>
-                                  <w:szCs w:val="24"/>
-                                </w:rPr>
-                              </w:pPr>
-                              <w:del w:id="7" w:author="RuiLiu" w:date="2019-05-21T11:26:00Z">
-                                <w:r>
-                                  <w:rPr>
-                                    <w:rFonts w:ascii="Times New Roman" w:hAnsi="Times New Roman" w:cs="Times New Roman"/>
-                                    <w:sz w:val="24"/>
-                                    <w:szCs w:val="24"/>
-                                  </w:rPr>
-                                  <w:delText>State Key Laboratory for Agrobiotechnology, China Agricultural University</w:delText>
-                                </w:r>
-                              </w:del>
-                            </w:p>
-                            <w:p>
-                              <w:pPr>
-                                <w:spacing w:line="480" w:lineRule="auto"/>
-                                <w:rPr>
-                                  <w:del w:id="8" w:author="RuiLiu" w:date="2019-05-21T11:26:00Z"/>
-                                  <w:rStyle w:val="a7"/>
-                                  <w:rFonts w:ascii="Times New Roman" w:hAnsi="Times New Roman" w:cs="Times New Roman"/>
-                                  <w:sz w:val="24"/>
-                                  <w:szCs w:val="24"/>
-                                </w:rPr>
-                              </w:pPr>
-                              <w:del w:id="9" w:author="RuiLiu" w:date="2019-05-21T11:26:00Z">
-                                <w:r>
-                                  <w:rPr>
-                                    <w:rFonts w:ascii="Times New Roman" w:hAnsi="Times New Roman" w:cs="Times New Roman"/>
-                                    <w:sz w:val="24"/>
-                                    <w:szCs w:val="24"/>
-                                  </w:rPr>
-                                  <w:delText>Email: cauhyh@cau.edu.cn</w:delText>
-                                </w:r>
-                              </w:del>
-                            </w:p>
-                            <w:p>
-                              <w:pPr>
-                                <w:spacing w:line="480" w:lineRule="auto"/>
-                                <w:rPr>
-                                  <w:del w:id="10" w:author="RuiLiu" w:date="2019-05-21T11:26:00Z"/>
-                                  <w:rStyle w:val="a7"/>
-                                  <w:rFonts w:ascii="Times New Roman" w:hAnsi="Times New Roman" w:cs="Times New Roman"/>
-                                  <w:color w:val="000000"/>
-                                  <w:sz w:val="24"/>
-                                  <w:szCs w:val="24"/>
-                                </w:rPr>
-                              </w:pPr>
-                              <w:del w:id="11" w:author="RuiLiu" w:date="2019-05-21T11:26:00Z">
-                                <w:r>
-                                  <w:rPr>
-                                    <w:rStyle w:val="a7"/>
-                                    <w:rFonts w:ascii="Times New Roman" w:hAnsi="Times New Roman" w:cs="Times New Roman"/>
-                                    <w:color w:val="000000"/>
-                                    <w:sz w:val="24"/>
-                                    <w:szCs w:val="24"/>
-                                  </w:rPr>
-                                  <w:delText xml:space="preserve">Tel: 0086 10 6273 3123  </w:delText>
-                                </w:r>
-                              </w:del>
-                            </w:p>
-                            <w:p>
-                              <w:pPr>
-                                <w:spacing w:line="480" w:lineRule="auto"/>
-                                <w:rPr>
-                                  <w:rFonts w:ascii="Times New Roman" w:hAnsi="Times New Roman" w:cs="Times New Roman"/>
-                                  <w:sz w:val="24"/>
-                                  <w:szCs w:val="24"/>
-                                </w:rPr>
-                              </w:pPr>
-                              <w:del w:id="12" w:author="RuiLiu" w:date="2019-05-21T11:26:00Z">
-                                <w:r>
-                                  <w:rPr>
-                                    <w:rStyle w:val="a7"/>
-                                    <w:rFonts w:ascii="Times New Roman" w:hAnsi="Times New Roman" w:cs="Times New Roman"/>
-                                    <w:color w:val="000000"/>
-                                    <w:sz w:val="24"/>
-                                    <w:szCs w:val="24"/>
-                                  </w:rPr>
-                                  <w:delText>Fax: 0086 10 6273 3904</w:delText>
-                                </w:r>
-                              </w:del>
-                            </w:p>
-                          </w:txbxContent>
-                        </wps:txbx>
-                        <wps:bodyPr rot="0" vert="horz" wrap="square" lIns="91440" tIns="45720" rIns="91440" bIns="45720" anchor="t" anchorCtr="0">
-                          <a:noAutofit/>
-                        </wps:bodyPr>
-                      </wps:wsp>
-                    </a:graphicData>
-                  </a:graphic>
-                  <wp14:sizeRelH relativeFrom="margin">
-                    <wp14:pctWidth>0</wp14:pctWidth>
-                  </wp14:sizeRelH>
-                  <wp14:sizeRelV relativeFrom="margin">
-                    <wp14:pctHeight>0</wp14:pctHeight>
-                  </wp14:sizeRelV>
-                </wp:anchor>
-              </w:drawing>
-            </mc:Choice>
-            <mc:Fallback>
-              <w:pict>
-                <v:shapetype w14:anchorId="45965670" id="_x0000_t202" coordsize="21600,21600" o:spt="202" path="m,l,21600r21600,l21600,xe">
-                  <v:stroke joinstyle="miter"/>
-                  <v:path gradientshapeok="t" o:connecttype="rect"/>
-                </v:shapetype>
-                <v:shape id="文本框 3" o:spid="_x0000_s1026" type="#_x0000_t202" style="position:absolute;left:0;text-align:left;margin-left:0;margin-top:57.3pt;width:173.6pt;height:262.3pt;z-index:251659264;visibility:visible;mso-wrap-style:square;mso-width-percent:0;mso-height-percent:0;mso-wrap-distance-left:9pt;mso-wrap-distance-top:0;mso-wrap-distance-right:9pt;mso-wrap-distance-bottom:0;mso-position-horizontal:absolute;mso-position-horizontal-relative:margin;mso-position-vertical:absolute;mso-position-vertical-relative:text;mso-width-percent:0;mso-height-percent:0;mso-width-relative:margin;mso-height-relative:margin;v-text-anchor:top" o:gfxdata="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" filled="f" stroked="f">
-                  <v:textbox>
-                    <w:txbxContent>
-                      <w:p>
-                        <w:pPr>
-                          <w:spacing w:line="480" w:lineRule="auto"/>
-                          <w:rPr>
-                            <w:del w:id="13" w:author="RuiLiu" w:date="2019-05-21T11:26:00Z"/>
-                            <w:rFonts w:ascii="Times New Roman" w:hAnsi="Times New Roman" w:cs="Times New Roman"/>
-                            <w:sz w:val="24"/>
-                            <w:szCs w:val="24"/>
-                          </w:rPr>
-                        </w:pPr>
-                        <w:bookmarkStart w:id="14" w:name="_GoBack"/>
-                        <w:bookmarkEnd w:id="14"/>
-                        <w:del w:id="15" w:author="RuiLiu" w:date="2019-05-21T11:26:00Z">
-                          <w:r>
-                            <w:rPr>
-                              <w:rFonts w:ascii="Times New Roman" w:hAnsi="Times New Roman" w:cs="Times New Roman"/>
-                              <w:sz w:val="24"/>
-                              <w:szCs w:val="24"/>
-                            </w:rPr>
-                            <w:delText>Yinhua Huang</w:delText>
-                          </w:r>
-                        </w:del>
-                      </w:p>
-                      <w:p>
-                        <w:pPr>
-                          <w:spacing w:line="480" w:lineRule="auto"/>
-                          <w:rPr>
-                            <w:del w:id="16" w:author="RuiLiu" w:date="2019-05-21T11:26:00Z"/>
-                            <w:rFonts w:ascii="Times New Roman" w:hAnsi="Times New Roman" w:cs="Times New Roman"/>
-                            <w:sz w:val="24"/>
-                            <w:szCs w:val="24"/>
-                          </w:rPr>
-                        </w:pPr>
-                        <w:del w:id="17" w:author="RuiLiu" w:date="2019-05-21T11:26:00Z">
-                          <w:r>
-                            <w:rPr>
-                              <w:rFonts w:ascii="Times New Roman" w:hAnsi="Times New Roman" w:cs="Times New Roman"/>
-                              <w:sz w:val="24"/>
-                              <w:szCs w:val="24"/>
-                            </w:rPr>
-                            <w:delText>Professor, Ph.D.</w:delText>
-                          </w:r>
-                        </w:del>
-                      </w:p>
-                      <w:p>
-                        <w:pPr>
-                          <w:spacing w:line="480" w:lineRule="auto"/>
-                          <w:rPr>
-                            <w:del w:id="18" w:author="RuiLiu" w:date="2019-05-21T11:26:00Z"/>
-                            <w:rFonts w:ascii="Times New Roman" w:hAnsi="Times New Roman" w:cs="Times New Roman"/>
-                            <w:sz w:val="24"/>
-                            <w:szCs w:val="24"/>
-                          </w:rPr>
-                        </w:pPr>
-                        <w:del w:id="19" w:author="RuiLiu" w:date="2019-05-21T11:26:00Z">
-                          <w:r>
-                            <w:rPr>
-                              <w:rFonts w:ascii="Times New Roman" w:hAnsi="Times New Roman" w:cs="Times New Roman"/>
-                              <w:sz w:val="24"/>
-                              <w:szCs w:val="24"/>
-                            </w:rPr>
-                            <w:delText>State Key Laboratory for Agrobiotechnology, China Agricultural University</w:delText>
-                          </w:r>
-                        </w:del>
-                      </w:p>
-                      <w:p>
-                        <w:pPr>
-                          <w:spacing w:line="480" w:lineRule="auto"/>
-                          <w:rPr>
-                            <w:del w:id="20" w:author="RuiLiu" w:date="2019-05-21T11:26:00Z"/>
-                            <w:rStyle w:val="a7"/>
-                            <w:rFonts w:ascii="Times New Roman" w:hAnsi="Times New Roman" w:cs="Times New Roman"/>
-                            <w:sz w:val="24"/>
-                            <w:szCs w:val="24"/>
-                          </w:rPr>
-                        </w:pPr>
-                        <w:del w:id="21" w:author="RuiLiu" w:date="2019-05-21T11:26:00Z">
-                          <w:r>
-                            <w:rPr>
-                              <w:rFonts w:ascii="Times New Roman" w:hAnsi="Times New Roman" w:cs="Times New Roman"/>
-                              <w:sz w:val="24"/>
-                              <w:szCs w:val="24"/>
-                            </w:rPr>
-                            <w:delText>Email: cauhyh@cau.edu.cn</w:delText>
-                          </w:r>
-                        </w:del>
-                      </w:p>
-                      <w:p>
-                        <w:pPr>
-                          <w:spacing w:line="480" w:lineRule="auto"/>
-                          <w:rPr>
-                            <w:del w:id="22" w:author="RuiLiu" w:date="2019-05-21T11:26:00Z"/>
-                            <w:rStyle w:val="a7"/>
-                            <w:rFonts w:ascii="Times New Roman" w:hAnsi="Times New Roman" w:cs="Times New Roman"/>
-                            <w:color w:val="000000"/>
-                            <w:sz w:val="24"/>
-                            <w:szCs w:val="24"/>
-                          </w:rPr>
-                        </w:pPr>
-                        <w:del w:id="23" w:author="RuiLiu" w:date="2019-05-21T11:26:00Z">
-                          <w:r>
-                            <w:rPr>
-                              <w:rStyle w:val="a7"/>
-                              <w:rFonts w:ascii="Times New Roman" w:hAnsi="Times New Roman" w:cs="Times New Roman"/>
-                              <w:color w:val="000000"/>
-                              <w:sz w:val="24"/>
-                              <w:szCs w:val="24"/>
-                            </w:rPr>
-                            <w:delText xml:space="preserve">Tel: 0086 10 6273 3123  </w:delText>
-                          </w:r>
-                        </w:del>
-                      </w:p>
-                      <w:p>
-                        <w:pPr>
-                          <w:spacing w:line="480" w:lineRule="auto"/>
-                          <w:rPr>
-                            <w:rFonts w:ascii="Times New Roman" w:hAnsi="Times New Roman" w:cs="Times New Roman"/>
-                            <w:sz w:val="24"/>
-                            <w:szCs w:val="24"/>
-                          </w:rPr>
-                        </w:pPr>
-                        <w:del w:id="24" w:author="RuiLiu" w:date="2019-05-21T11:26:00Z">
-                          <w:r>
-                            <w:rPr>
-                              <w:rStyle w:val="a7"/>
-                              <w:rFonts w:ascii="Times New Roman" w:hAnsi="Times New Roman" w:cs="Times New Roman"/>
-                              <w:color w:val="000000"/>
-                              <w:sz w:val="24"/>
-                              <w:szCs w:val="24"/>
-                            </w:rPr>
-                            <w:delText>Fax: 0086 10 6273 3904</w:delText>
-                          </w:r>
-                        </w:del>
-                      </w:p>
-                    </w:txbxContent>
-                  </v:textbox>
-                  <w10:wrap anchorx="margin"/>
-                </v:shape>
-              </w:pict>
-            </mc:Fallback>
-          </mc:AlternateContent>
-        </w:r>
-      </w:del>
+      <w:r>
+        <w:rPr>
+          <w:rFonts w:ascii="Times New Roman" w:eastAsia="等线" w:hAnsi="Times New Roman" w:cs="Times New Roman"/>
+          <w:color w:val="000000"/>
+          <w:sz w:val="24"/>
+          <w:szCs w:val="24"/>
+        </w:rPr>
+        <w:t xml:space="preserve">We are very much looking forward to </w:t>
+      </w:r>
+      <w:r>
+        <w:rPr>
+          <w:rFonts w:ascii="Times New Roman" w:eastAsia="等线" w:hAnsi="Times New Roman" w:cs="Times New Roman"/>
+          <w:color w:val="000000"/>
+          <w:sz w:val="24"/>
+          <w:szCs w:val="24"/>
+        </w:rPr>
+        <w:t xml:space="preserve">publish our </w:t>
+      </w:r>
+      <w:r>
+        <w:rPr>
+          <w:rFonts w:ascii="Times New Roman" w:eastAsia="等线" w:hAnsi="Times New Roman" w:cs="Times New Roman"/>
+          <w:color w:val="000000"/>
+          <w:sz w:val="24"/>
+          <w:szCs w:val="24"/>
+        </w:rPr>
+        <w:t xml:space="preserve">paper through </w:t>
+      </w:r>
+      <w:r>
+        <w:rPr>
+          <w:rFonts w:ascii="Times New Roman" w:eastAsia="等线" w:hAnsi="Times New Roman" w:cs="Times New Roman"/>
+          <w:b/>
+          <w:i/>
+          <w:color w:val="000000"/>
+          <w:sz w:val="24"/>
+          <w:szCs w:val="24"/>
+        </w:rPr>
+        <w:t>Molecular Ecology</w:t>
+      </w:r>
+      <w:r>
+        <w:rPr>
+          <w:rFonts w:ascii="Times New Roman" w:eastAsia="等线" w:hAnsi="Times New Roman" w:cs="Times New Roman"/>
+          <w:sz w:val="24"/>
+          <w:szCs w:val="24"/>
+        </w:rPr>
+        <w:t>.</w:t>
+      </w:r>
+    </w:p>
+    <w:p>
+      <w:pPr>
+        <w:rPr>
+          <w:rFonts w:ascii="Times New Roman" w:hAnsi="Times New Roman" w:cs="Times New Roman"/>
+          <w:sz w:val="24"/>
+          <w:szCs w:val="24"/>
+        </w:rPr>
+      </w:pPr>
       <w:r>
         <w:rPr>
           <w:rFonts w:ascii="Arial" w:eastAsia="等线" w:hAnsi="Arial" w:cs="Arial"/>
@@ -2061,15 +1764,15 @@
         <mc:AlternateContent>
           <mc:Choice Requires="wps">
             <w:drawing>
-              <wp:anchor distT="0" distB="0" distL="114300" distR="114300" simplePos="0" relativeHeight="251660288" behindDoc="0" locked="0" layoutInCell="1" allowOverlap="1" wp14:anchorId="735E55D4" wp14:editId="0D74DBC8">
+              <wp:anchor distT="0" distB="0" distL="114300" distR="114300" simplePos="0" relativeHeight="251660288" behindDoc="0" locked="0" layoutInCell="1" allowOverlap="1" wp14:anchorId="735E55D4" wp14:editId="33D2779E">
                 <wp:simplePos x="0" y="0"/>
                 <wp:positionH relativeFrom="margin">
-                  <wp:posOffset>2874010</wp:posOffset>
+                  <wp:align>right</wp:align>
                 </wp:positionH>
                 <wp:positionV relativeFrom="paragraph">
-                  <wp:posOffset>722630</wp:posOffset>
+                  <wp:posOffset>101600</wp:posOffset>
                 </wp:positionV>
-                <wp:extent cx="2204720" cy="3331210"/>
+                <wp:extent cx="5276850" cy="3331210"/>
                 <wp:effectExtent l="0" t="0" r="0" b="2540"/>
                 <wp:wrapNone/>
                 <wp:docPr id="1" name="文本框 1"/>
@@ -2085,7 +1788,7 @@
                       <wps:spPr bwMode="auto">
                         <a:xfrm>
                           <a:off x="0" y="0"/>
-                          <a:ext cx="2204720" cy="3331210"/>
+                          <a:ext cx="5276850" cy="3331210"/>
                         </a:xfrm>
                         <a:prstGeom prst="rect">
                           <a:avLst/>
@@ -2115,7 +1818,16 @@
                                 <w:sz w:val="24"/>
                                 <w:szCs w:val="24"/>
                               </w:rPr>
-                              <w:t>Ning Li</w:t>
+                              <w:t>N</w:t>
+                            </w:r>
+                            <w:bookmarkStart w:id="0" w:name="_GoBack"/>
+                            <w:r>
+                              <w:rPr>
+                                <w:rFonts w:ascii="Times New Roman" w:hAnsi="Times New Roman" w:cs="Times New Roman"/>
+                                <w:sz w:val="24"/>
+                                <w:szCs w:val="24"/>
+                              </w:rPr>
+                              <w:t>ing Li</w:t>
                             </w:r>
                           </w:p>
                           <w:p>
@@ -2226,6 +1938,7 @@
                               </w:rPr>
                               <w:t>Fax: 0086 10 6273 3904</w:t>
                             </w:r>
+                            <w:bookmarkEnd w:id="0"/>
                           </w:p>
                         </w:txbxContent>
                       </wps:txbx>
@@ -2246,7 +1959,11 @@
           </mc:Choice>
           <mc:Fallback>
             <w:pict>
-              <v:shape w14:anchorId="735E55D4" id="文本框 1" o:spid="_x0000_s1027" type="#_x0000_t202" style="position:absolute;left:0;text-align:left;margin-left:226.3pt;margin-top:56.9pt;width:173.6pt;height:262.3pt;z-index:251660288;visibility:visible;mso-wrap-style:square;mso-width-percent:0;mso-height-percent:0;mso-wrap-distance-left:9pt;mso-wrap-distance-top:0;mso-wrap-distance-right:9pt;mso-wrap-distance-bottom:0;mso-position-horizontal:absolute;mso-position-horizontal-relative:margin;mso-position-vertical:absolute;mso-position-vertical-relative:text;mso-width-percent:0;mso-height-percent:0;mso-width-relative:margin;mso-height-relative:margin;v-text-anchor:top" o:gfxdata="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" filled="f" stroked="f">
+              <v:shapetype w14:anchorId="735E55D4" id="_x0000_t202" coordsize="21600,21600" o:spt="202" path="m,l,21600r21600,l21600,xe">
+                <v:stroke joinstyle="miter"/>
+                <v:path gradientshapeok="t" o:connecttype="rect"/>
+              </v:shapetype>
+              <v:shape id="文本框 1" o:spid="_x0000_s1026" type="#_x0000_t202" style="position:absolute;left:0;text-align:left;margin-left:364.3pt;margin-top:8pt;width:415.5pt;height:262.3pt;z-index:251660288;visibility:visible;mso-wrap-style:square;mso-width-percent:0;mso-height-percent:0;mso-wrap-distance-left:9pt;mso-wrap-distance-top:0;mso-wrap-distance-right:9pt;mso-wrap-distance-bottom:0;mso-position-horizontal:right;mso-position-horizontal-relative:margin;mso-position-vertical:absolute;mso-position-vertical-relative:text;mso-width-percent:0;mso-height-percent:0;mso-width-relative:margin;mso-height-relative:margin;v-text-anchor:top" o:gfxdata="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" filled="f" stroked="f">
                 <v:textbox>
                   <w:txbxContent>
                     <w:p>
@@ -2264,7 +1981,16 @@
                           <w:sz w:val="24"/>
                           <w:szCs w:val="24"/>
                         </w:rPr>
-                        <w:t>Ning Li</w:t>
+                        <w:t>N</w:t>
+                      </w:r>
+                      <w:bookmarkStart w:id="1" w:name="_GoBack"/>
+                      <w:r>
+                        <w:rPr>
+                          <w:rFonts w:ascii="Times New Roman" w:hAnsi="Times New Roman" w:cs="Times New Roman"/>
+                          <w:sz w:val="24"/>
+                          <w:szCs w:val="24"/>
+                        </w:rPr>
+                        <w:t>ing Li</w:t>
                       </w:r>
                     </w:p>
                     <w:p>
@@ -2375,6 +2101,7 @@
                         </w:rPr>
                         <w:t>Fax: 0086 10 6273 3904</w:t>
                       </w:r>
+                      <w:bookmarkEnd w:id="1"/>
                     </w:p>
                   </w:txbxContent>
                 </v:textbox>
@@ -2384,61 +2111,6 @@
           </mc:Fallback>
         </mc:AlternateContent>
       </w:r>
-      <w:r>
-        <w:rPr>
-          <w:rFonts w:ascii="Times New Roman" w:eastAsia="等线" w:hAnsi="Times New Roman" w:cs="Times New Roman"/>
-          <w:color w:val="000000"/>
-          <w:sz w:val="24"/>
-          <w:szCs w:val="24"/>
-        </w:rPr>
-        <w:t xml:space="preserve">We are very much looking forward to </w:t>
-      </w:r>
-      <w:r>
-        <w:rPr>
-          <w:rFonts w:ascii="Times New Roman" w:eastAsia="等线" w:hAnsi="Times New Roman" w:cs="Times New Roman"/>
-          <w:color w:val="000000"/>
-          <w:sz w:val="24"/>
-          <w:szCs w:val="24"/>
-        </w:rPr>
-        <w:t xml:space="preserve">publish our </w:t>
-      </w:r>
-      <w:r>
-        <w:rPr>
-          <w:rFonts w:ascii="Times New Roman" w:eastAsia="等线" w:hAnsi="Times New Roman" w:cs="Times New Roman"/>
-          <w:color w:val="000000"/>
-          <w:sz w:val="24"/>
-          <w:szCs w:val="24"/>
-        </w:rPr>
-        <w:t xml:space="preserve">paper through </w:t>
-      </w:r>
-      <w:r>
-        <w:rPr>
-          <w:rFonts w:ascii="Times New Roman" w:eastAsia="等线" w:hAnsi="Times New Roman" w:cs="Times New Roman"/>
-          <w:b/>
-          <w:i/>
-          <w:color w:val="000000"/>
-          <w:sz w:val="24"/>
-          <w:szCs w:val="24"/>
-        </w:rPr>
-        <w:t>Molecular Ecology</w:t>
-      </w:r>
-      <w:r>
-        <w:rPr>
-          <w:rFonts w:ascii="Times New Roman" w:eastAsia="等线" w:hAnsi="Times New Roman" w:cs="Times New Roman"/>
-          <w:sz w:val="24"/>
-          <w:szCs w:val="24"/>
-        </w:rPr>
-        <w:t>.</w:t>
-      </w:r>
-    </w:p>
-    <w:p>
-      <w:pPr>
-        <w:rPr>
-          <w:rFonts w:ascii="Times New Roman" w:hAnsi="Times New Roman" w:cs="Times New Roman"/>
-          <w:sz w:val="24"/>
-          <w:szCs w:val="24"/>
-        </w:rPr>
-      </w:pPr>
     </w:p>
     <w:sectPr>
       <w:pgSz w:w="11906" w:h="16838"/>
@@ -2486,14 +2158,6 @@
     </w:p>
   </w:footnote>
 </w:footnotes>
-</file>
-
-<file path=word/people.xml><?xml version="1.0" encoding="utf-8"?>
-<w15:people xmlns:wpc="http://schemas.microsoft.com/office/word/2010/wordprocessingCanvas" xmlns:cx="http://schemas.microsoft.com/office/drawing/2014/chartex" xmlns:cx1="http://schemas.microsoft.com/office/drawing/2015/9/8/chartex" xmlns:cx2="http://schemas.microsoft.com/office/drawing/2015/10/21/chartex" xmlns:cx3="http://schemas.microsoft.com/office/drawing/2016/5/9/chartex" xmlns:cx4="http://schemas.microsoft.com/office/drawing/2016/5/10/chartex" xmlns:cx5="http://schemas.microsoft.com/office/drawing/2016/5/11/chartex" xmlns:cx6="http://schemas.microsoft.com/office/drawing/2016/5/12/chartex" xmlns:cx7="http://schemas.microsoft.com/office/drawing/2016/5/13/chartex" xmlns:cx8="http://schemas.microsoft.com/office/drawing/2016/5/14/chartex" xmlns:mc="http://schemas.openxmlformats.org/markup-compatibility/2006" xmlns:aink="http://schemas.microsoft.com/office/drawing/2016/ink" xmlns:am3d="http://schemas.microsoft.com/office/drawing/2017/model3d" xmlns:o="urn:schemas-microsoft-com:office:office" xmlns:r="http://schemas.openxmlformats.org/officeDocument/2006/relationships" xmlns:m="http://schemas.openxmlformats.org/officeDocument/2006/math" xmlns:v="urn:schemas-microsoft-com:vml" xmlns:wp14="http://schemas.microsoft.com/office/word/2010/wordprocessingDrawing" xmlns:wp="http://schemas.openxmlformats.org/drawingml/2006/wordprocessingDrawing" xmlns:w10="urn:schemas-microsoft-com:office:word" xmlns:w="http://schemas.openxmlformats.org/wordprocessingml/2006/main" xmlns:w14="http://schemas.microsoft.com/office/word/2010/wordml" xmlns:w15="http://schemas.microsoft.com/office/word/2012/wordml" xmlns:w16cid="http://schemas.microsoft.com/office/word/2016/wordml/cid" xmlns:w16se="http://schemas.microsoft.com/office/word/2015/wordml/symex" xmlns:wpg="http://schemas.microsoft.com/office/word/2010/wordprocessingGroup" xmlns:wpi="http://schemas.microsoft.com/office/word/2010/wordprocessingInk" xmlns:wne="http://schemas.microsoft.com/office/word/2006/wordml" xmlns:wps="http://schemas.microsoft.com/office/word/2010/wordprocessingShape" mc:Ignorable="w14 w15 w16se w16cid wp14">
-  <w15:person w15:author="RuiLiu">
-    <w15:presenceInfo w15:providerId="None" w15:userId="RuiLiu"/>
-  </w15:person>
-</w15:people>
 </file>
 
 <file path=word/styles.xml><?xml version="1.0" encoding="utf-8"?>
@@ -2616,6 +2280,7 @@
     <w:lsdException w:name="HTML Sample" w:semiHidden="1" w:unhideWhenUsed="1"/>
     <w:lsdException w:name="HTML Typewriter" w:semiHidden="1" w:unhideWhenUsed="1"/>
     <w:lsdException w:name="HTML Variable" w:semiHidden="1" w:unhideWhenUsed="1"/>
+    <w:lsdException w:name="Normal Table" w:semiHidden="1" w:unhideWhenUsed="1"/>
     <w:lsdException w:name="annotation subject" w:semiHidden="1" w:unhideWhenUsed="1"/>
     <w:lsdException w:name="No List" w:semiHidden="1" w:unhideWhenUsed="1"/>
     <w:lsdException w:name="Outline List 1" w:semiHidden="1" w:unhideWhenUsed="1"/>
@@ -2662,8 +2327,10 @@
     <w:lsdException w:name="Table Subtle 2" w:semiHidden="1" w:unhideWhenUsed="1"/>
     <w:lsdException w:name="Table Web 1" w:semiHidden="1" w:unhideWhenUsed="1"/>
     <w:lsdException w:name="Table Web 2" w:semiHidden="1" w:unhideWhenUsed="1"/>
+    <w:lsdException w:name="Table Web 3" w:semiHidden="1" w:unhideWhenUsed="1"/>
     <w:lsdException w:name="Balloon Text" w:semiHidden="1" w:unhideWhenUsed="1"/>
     <w:lsdException w:name="Table Grid" w:uiPriority="39"/>
+    <w:lsdException w:name="Table Theme" w:semiHidden="1" w:unhideWhenUsed="1"/>
     <w:lsdException w:name="Placeholder Text" w:semiHidden="1"/>
     <w:lsdException w:name="No Spacing" w:uiPriority="1" w:qFormat="1"/>
     <w:lsdException w:name="Light Shading" w:uiPriority="60"/>

</xml_diff>